<commit_message>
docs: Finalize project proposal and SRS
Align the handover documents with the implemented features and verified test results.

Co-Authored-By: Codex <noreply@openai.com>
</commit_message>
<xml_diff>
--- a/docs/BaoCao_SmartExpense_Project_Proposal.docx
+++ b/docs/BaoCao_SmartExpense_Project_Proposal.docx
@@ -697,7 +697,7 @@
               <w:pStyle w:val="TableText"/>
             </w:pPr>
             <w:r>
-              <w:t>Website demo đã báo cáo triển khai</w:t>
+              <w:t>Website demo (HTTPS)</w:t>
             </w:r>
           </w:p>
         </w:tc>
@@ -855,21 +855,6 @@
     </w:p>
     <w:p>
       <w:pPr>
-        <w:pStyle w:val="HighlightNote"/>
-        <w:ind w:left="142" w:right="113"/>
-      </w:pPr>
-      <w:r>
-        <w:rPr>
-          <w:b/>
-        </w:rPr>
-        <w:t xml:space="preserve">Ghi chú: </w:t>
-      </w:r>
-      <w:r>
-        <w:t>Đường dẫn website và trạng thái triển khai được ghi theo báo cáo của nhóm; cần mở kiểm tra lại trước khi nộp. Không dùng liên kết Trello /invite/ trong Proposal.</w:t>
-      </w:r>
-    </w:p>
-    <w:p>
-      <w:pPr>
         <w:pStyle w:val="SectionHead"/>
         <w:pageBreakBefore/>
         <w:pBdr>
@@ -894,7 +879,7 @@
         <w:tblLook w:val="04A0" w:firstRow="1" w:lastRow="0" w:firstColumn="1" w:lastColumn="0" w:noHBand="0" w:noVBand="1"/>
       </w:tblPr>
       <w:tblGrid>
-        <w:gridCol w:w="567"/>
+        <w:gridCol w:w="742"/>
         <w:gridCol w:w="2353"/>
         <w:gridCol w:w="1843"/>
         <w:gridCol w:w="4762"/>
@@ -907,7 +892,7 @@
         </w:trPr>
         <w:tc>
           <w:tcPr>
-            <w:tcW w:w="567" w:type="dxa"/>
+            <w:tcW w:w="742" w:type="dxa"/>
             <w:tcBorders>
               <w:top w:val="single" w:sz="5" w:space="0" w:color="1E3A5F"/>
               <w:left w:val="single" w:sz="5" w:space="0" w:color="1E3A5F"/>
@@ -1017,7 +1002,7 @@
         </w:trPr>
         <w:tc>
           <w:tcPr>
-            <w:tcW w:w="567" w:type="dxa"/>
+            <w:tcW w:w="742" w:type="dxa"/>
             <w:tcBorders>
               <w:top w:val="single" w:sz="5" w:space="0" w:color="D7E0E8"/>
               <w:left w:val="single" w:sz="5" w:space="0" w:color="D7E0E8"/>
@@ -1138,7 +1123,7 @@
         </w:trPr>
         <w:tc>
           <w:tcPr>
-            <w:tcW w:w="567" w:type="dxa"/>
+            <w:tcW w:w="742" w:type="dxa"/>
             <w:tcBorders>
               <w:top w:val="single" w:sz="5" w:space="0" w:color="D7E0E8"/>
               <w:left w:val="single" w:sz="5" w:space="0" w:color="D7E0E8"/>
@@ -1255,7 +1240,7 @@
         </w:trPr>
         <w:tc>
           <w:tcPr>
-            <w:tcW w:w="567" w:type="dxa"/>
+            <w:tcW w:w="742" w:type="dxa"/>
             <w:tcBorders>
               <w:top w:val="single" w:sz="5" w:space="0" w:color="D7E0E8"/>
               <w:left w:val="single" w:sz="5" w:space="0" w:color="D7E0E8"/>
@@ -1377,18 +1362,6 @@
     </w:p>
     <w:p>
       <w:pPr>
-        <w:pStyle w:val="HighlightNote"/>
-        <w:ind w:left="142" w:right="113"/>
-      </w:pPr>
-      <w:r>
-        <w:rPr>
-          <w:b/>
-        </w:rPr>
-        <w:t>Ghi chú: Thành viên thứ ba là Phạm Hương Quỳnh; mã sinh viên của các thành viên chưa được cung cấp. Tên tài khoản Trello của người phụ trách Frontend hiển thị khác thứ tự họ tên trong báo cáo; cần đối chiếu trước khi nộp.</w:t>
-      </w:r>
-    </w:p>
-    <w:p>
-      <w:pPr>
         <w:pStyle w:val="SectionHead"/>
         <w:pBdr>
           <w:bottom w:val="single" w:sz="9" w:space="3" w:color="1E3A5F"/>
@@ -1472,7 +1445,7 @@
         <w:t xml:space="preserve">•  Thống kê: </w:t>
       </w:r>
       <w:r>
-        <w:t>tổng hợp thu nhập, chi tiêu, số dư và hiển thị biểu đồ chi tiêu theo danh mục.</w:t>
+        <w:t>tổng hợp thu nhập, chi tiêu, số dư; biểu đồ chi tiêu theo danh mục và thu–chi theo ngày trong tháng.</w:t>
       </w:r>
     </w:p>
     <w:p>
@@ -1494,7 +1467,6 @@
         <w:pStyle w:val="SubHead"/>
       </w:pPr>
       <w:r>
-        <w:lastRenderedPageBreak/>
         <w:t>3.3. Đối tượng sử dụng</w:t>
       </w:r>
     </w:p>
@@ -1511,6 +1483,7 @@
         </w:pBdr>
       </w:pPr>
       <w:r>
+        <w:lastRenderedPageBreak/>
         <w:t>4. PHẠM VI VÀ CÁC CHỨC NĂNG CHÍNH (MVP)</w:t>
       </w:r>
     </w:p>
@@ -1639,7 +1612,7 @@
               <w:pStyle w:val="TableText"/>
             </w:pPr>
             <w:r>
-              <w:t>Đăng ký, đăng nhập, JWT, BCrypt; bảo vệ route trên Frontend và API trên Backend.</w:t>
+              <w:t>Đăng ký, đăng nhập, JWT, BCrypt; bảo vệ màn hình nghiệp vụ và API; có trang giới thiệu cho khách.</w:t>
             </w:r>
           </w:p>
         </w:tc>
@@ -1757,7 +1730,7 @@
               <w:pStyle w:val="TableText"/>
             </w:pPr>
             <w:r>
-              <w:t>CRUD giao dịch: số tiền, loại, danh mục, ngày và ghi chú; kiểm tra tính hợp lệ đầu vào.</w:t>
+              <w:t>CRUD giao dịch; kiểm tra đầu vào; lọc theo ngày, loại, danh mục, từ khóa và phân trang.</w:t>
             </w:r>
           </w:p>
         </w:tc>
@@ -1815,7 +1788,7 @@
               <w:pStyle w:val="TableText"/>
             </w:pPr>
             <w:r>
-              <w:t>Đặt và cập nhật hạn mức hàng tháng; so sánh chi tiêu thực tế với ngân sách.</w:t>
+              <w:t>Đặt, cập nhật, xóa ngân sách tháng; so sánh chi tiêu thực tế với hạn mức và cảnh báo mức sử dụng.</w:t>
             </w:r>
           </w:p>
         </w:tc>
@@ -1875,7 +1848,7 @@
               <w:pStyle w:val="TableText"/>
             </w:pPr>
             <w:r>
-              <w:t>Các chỉ số tổng hợp thu nhập, chi tiêu, số dư; biểu đồ phân bổ chi tiêu bằng Recharts.</w:t>
+              <w:t>Tổng thu, tổng chi, số dư; biểu đồ phân bổ chi tiêu và dòng tiền theo ngày trong tháng bằng Recharts.</w:t>
             </w:r>
           </w:p>
         </w:tc>
@@ -1993,7 +1966,7 @@
               <w:pStyle w:val="TableText"/>
             </w:pPr>
             <w:r>
-              <w:t>Postman Collection; kiểm thử tích hợp thủ công; đóng gói Docker và GitHub Actions CI/CD.</w:t>
+              <w:t>Postman Collection, smoke test tự động; kiểm thử tích hợp; Docker Compose và GitHub Actions CI/CD.</w:t>
             </w:r>
           </w:p>
         </w:tc>
@@ -2153,7 +2126,7 @@
               <w:pStyle w:val="TableText"/>
             </w:pPr>
             <w:r>
-              <w:t>ReactJS + Vite, Tailwind CSS, React Router, Axios, Recharts.</w:t>
+              <w:t>React 19, Vite 8, Tailwind CSS 4, React Router, Axios, Recharts.</w:t>
             </w:r>
           </w:p>
         </w:tc>
@@ -2211,7 +2184,7 @@
               <w:pStyle w:val="TableText"/>
             </w:pPr>
             <w:r>
-              <w:t>Java, Spring Boot, Spring Security, JWT, Spring Data JPA, Gradle, RESTful API.</w:t>
+              <w:t>Java 21, Spring Boot 4.1.1, Spring Security, JWT, Spring Data JPA, Gradle, RESTful API.</w:t>
             </w:r>
           </w:p>
         </w:tc>
@@ -2362,7 +2335,6 @@
               <w:pStyle w:val="TableText"/>
             </w:pPr>
             <w:r>
-              <w:lastRenderedPageBreak/>
               <w:t>Tích hợp và kiểm thử</w:t>
             </w:r>
           </w:p>
@@ -2390,7 +2362,7 @@
               <w:pStyle w:val="TableText"/>
             </w:pPr>
             <w:r>
-              <w:t>Git/GitHub, GitHub Actions CI/CD, Postman; kiểm thử tích hợp và smoke test thủ công.</w:t>
+              <w:t>Git/GitHub, GitHub Actions, Postman; Node.js test runner, Gradle và script PowerShell kiểm thử tự động.</w:t>
             </w:r>
           </w:p>
         </w:tc>
@@ -2406,6 +2378,7 @@
         <w:pStyle w:val="SubHead"/>
       </w:pPr>
       <w:r>
+        <w:lastRenderedPageBreak/>
         <w:t>5.1. Luồng vận hành cơ bản</w:t>
       </w:r>
     </w:p>
@@ -2424,7 +2397,7 @@
     </w:p>
     <w:p>
       <w:r>
-        <w:t>Bốn thực thể nghiệp vụ chính: users, categories, transactions, monthly_budgets. users có quan hệ 1–n với categories, transactions và monthly_budgets; mỗi giao dịch gắn với một danh mục hợp lệ. Thiết kế được mô tả chi tiết tại tài liệu SRS/ERD của dự án.</w:t>
+        <w:t>Bốn bảng nghiệp vụ chính: users, categories, transactions, monthly_budgets. users có quan hệ 1–n với ba bảng còn lại; mỗi giao dịch gắn với một danh mục. Mỗi người dùng có tối đa một ngân sách cho mỗi tháng/năm. Cấu trúc được triển khai bằng JPA Entity.</w:t>
       </w:r>
     </w:p>
     <w:p>
@@ -2437,22 +2410,7 @@
     </w:p>
     <w:p>
       <w:r>
-        <w:t>Giữ tên database personal_finance_db và đường dẫn database/seed.sql. Kế hoạch reset cuối: sao lưu, kiểm chứng khả năng phục hồi, xin phê duyệt trước khi DROP/CREATE lại cùng tên, để JPA tạo các bảng rồi viết mới seed.sql. Không xóa Docker volume và không sử dụng lại dữ liệu nghiệp vụ cũ.</w:t>
-      </w:r>
-    </w:p>
-    <w:p>
-      <w:pPr>
-        <w:pStyle w:val="HighlightNote"/>
-        <w:ind w:left="142" w:right="113"/>
-      </w:pPr>
-      <w:r>
-        <w:rPr>
-          <w:b/>
-        </w:rPr>
-        <w:t xml:space="preserve">Ghi chú: </w:t>
-      </w:r>
-      <w:r>
-        <w:t>Reset cuối và nghiệm thu dữ liệu mẫu đang là công việc còn mở trên Trello; tài liệu này không khẳng định đã reset xong.</w:t>
+        <w:t>Database sử dụng tên personal_finance_db; Hibernate/JPA khởi tạo cấu trúc bảng. File database/seed.sql đã chuẩn bị 11 danh mục, 84 giao dịch và 3 ngân sách mẫu cho tháng 08–10/2026. Dữ liệu được lưu bằng Docker named volume; backup/restore có script riêng. Triển khai ứng dụng thông thường không yêu cầu reset database hoặc xóa volume.</w:t>
       </w:r>
     </w:p>
     <w:p>
@@ -2987,7 +2945,7 @@
               <w:pStyle w:val="TableText"/>
             </w:pPr>
             <w:r>
-              <w:t>Final database reset/seed, nghiệm thu Production, cập nhật Trello, hoàn thiện báo cáo và liên kết nộp.</w:t>
+              <w:t>Rà soát seed và Production; sửa biểu đồ, backup/restore; merge dev vào main và kiểm tra CI/CD; rà soát tài liệu bàn giao.</w:t>
             </w:r>
           </w:p>
         </w:tc>
@@ -3008,11 +2966,7 @@
     </w:p>
     <w:p>
       <w:r>
-        <w:t xml:space="preserve">Theo kết quả phát triển và các báo cáo đã trao đổi: Backend API và Postman đã được kiểm thử; các màn hình Frontend và Dashboard đã xây dựng; Docker Compose/VPS và GitHub </w:t>
-      </w:r>
-      <w:r>
-        <w:lastRenderedPageBreak/>
-        <w:t>Actions CD đã có báo cáo hoạt động. Bảng Trello được sắp xếp lại với 23 thẻ: 16 Đã xong, 3 Chờ kiểm tra và 4 Cần làm. Các số liệu phản ánh trạng thái ghi nhận, không thay thế kiểm thử nghiệm thu tại thời điểm nộp.</w:t>
+        <w:t>Bản bàn giao đã merge vào main tại commit 6ad376a; CI và CD của commit này thành công. Kiểm thử ghi nhận: 7/7 test frontend, 27/27 smoke test và 14/14 test backup/restore đạt. Trello tại thời điểm rà soát có 29 thẻ: 21 Đã xong, 2 Chờ kiểm tra, 3 Cần làm, 3 Backlog; một số thẻ chưa đồng bộ với code. Chưa kiểm thử E2E trình duyệt và tải dài hạn.</w:t>
       </w:r>
     </w:p>
     <w:p>
@@ -3023,6 +2977,7 @@
         </w:pBdr>
       </w:pPr>
       <w:r>
+        <w:lastRenderedPageBreak/>
         <w:t>7. QUY ƯỚC LÀM VIỆC VÀ THEO DÕI TRELLO</w:t>
       </w:r>
     </w:p>
@@ -3105,7 +3060,7 @@
     </w:p>
     <w:p>
       <w:r>
-        <w:t>Phân công đang ghi nhận trên thẻ: Tô Anh Tuấn phụ trách DOC/BE; Trần Thị Thu Trang phụ trách FE. Phạm Hương Quỳnh phụ trách DB/DevOps/QA; các thẻ tương ứng cần được gán thành viên chính thức trên Trello. Trạng thái gán thành viên chính thức và quyền xem bảng cần kiểm tra trước nộp.</w:t>
+        <w:t>Phân công của nhóm: Tô Anh Tuấn phụ trách DOC/BE; Trần Thị Thu Trang phụ trách FE; Phạm Hương Quỳnh phụ trách DB/DevOps/QA. Tại thời điểm rà soát, bảng Trello có hai thành viên Tuấn và Trang; việc thêm Quỳnh và gán người phụ trách trên các thẻ còn cần cập nhật. Trạng thái Trello được ghi nhận riêng với kết quả kiểm thử mã nguồn.</w:t>
       </w:r>
     </w:p>
     <w:p>
@@ -3116,7 +3071,7 @@
         </w:pBdr>
       </w:pPr>
       <w:r>
-        <w:t>8. KẾT QUẢ ĐẦU RA, RỦI RO VÀ VIỆC CẦN HOÀN TẤT</w:t>
+        <w:t>8. KẾT QUẢ ĐẦU RA</w:t>
       </w:r>
     </w:p>
     <w:p>
@@ -3152,7 +3107,7 @@
         <w:t xml:space="preserve">•  Tài liệu và quản lý: </w:t>
       </w:r>
       <w:r>
-        <w:t>Proposal, SRS, ERD, README, Postman Collection, tài liệu triển khai/QA và Trello.</w:t>
+        <w:t>Proposal, SRS, README dự án/frontend, Postman Collection, các script smoke test và kiểm thử backup/restore; bảng Trello.</w:t>
       </w:r>
     </w:p>
     <w:p>
@@ -3160,53 +3115,18 @@
         <w:pStyle w:val="SubHead"/>
       </w:pPr>
       <w:r>
-        <w:t>8.2. Các việc cần xác nhận trước khi nộp</w:t>
+        <w:t>8.</w:t>
       </w:r>
-    </w:p>
-    <w:p>
-      <w:pPr>
-        <w:ind w:left="198" w:hanging="113"/>
-      </w:pPr>
       <w:r>
-        <w:t>☐  Reset và nghiệm thu personal_finance_db (backup, JPA tạo lại bảng, seed.sql mới).</w:t>
+        <w:t>2</w:t>
       </w:r>
-    </w:p>
-    <w:p>
-      <w:pPr>
-        <w:ind w:left="198" w:hanging="113"/>
-      </w:pPr>
       <w:r>
-        <w:t>☐  Kiểm tra bản Auth UI đã merge, Production, JWT/API, Dashboard và Docker/HTTPS.</w:t>
-      </w:r>
-    </w:p>
-    <w:p>
-      <w:pPr>
-        <w:ind w:left="198" w:hanging="113"/>
-      </w:pPr>
-      <w:r>
-        <w:t>☐  Mời Phạm Hương Quỳnh vào Trello; xác nhận và gán người phụ trách chính thức cho các thẻ.</w:t>
-      </w:r>
-    </w:p>
-    <w:p>
-      <w:pPr>
-        <w:ind w:left="198" w:hanging="113"/>
-      </w:pPr>
-      <w:r>
-        <w:t>☐  Điền tên thành viên/MSV, lớp, giảng viên và kiểm tra mọi liên kết bàn giao.</w:t>
-      </w:r>
-    </w:p>
-    <w:p>
-      <w:pPr>
-        <w:pStyle w:val="SubHead"/>
-      </w:pPr>
-      <w:r>
-        <w:lastRenderedPageBreak/>
-        <w:t>8.3. Kết luận</w:t>
+        <w:t>. Kết luận</w:t>
       </w:r>
     </w:p>
     <w:p>
       <w:r>
-        <w:t>SmartExpense có đầy đủ cấu phần cốt lõi của một hệ thống quản lý tài chính cá nhân ở mức MVP, kết hợp quản lý nguồn Git, kiểm thử API, Docker và Trello. Các mục còn mở phải được nghiệm thu trước khi nhóm xác nhận hoàn thành bàn giao.</w:t>
+        <w:t>SmartExpense đã xây dựng các chức năng cốt lõi của MVP và có bản bàn giao trên main với CI/CD thành công. Các kịch bản kiểm thử đã thực hiện đều đạt trong phạm vi ghi nhận. Giới hạn còn lại: chưa kiểm thử E2E trình duyệt và tải dài hạn; xử lý mất kết nối, đồng bộ phiên hết hạn cần cải thiện. Trello và tài liệu cần tiếp tục đồng bộ với phiên bản mã nguồn.</w:t>
       </w:r>
     </w:p>
     <w:sectPr>
@@ -3248,36 +3168,54 @@
 
 <file path=word/footer1.xml><?xml version="1.0" encoding="utf-8"?>
 <w:ftr xmlns:wpc="http://schemas.microsoft.com/office/word/2010/wordprocessingCanvas" xmlns:cx="http://schemas.microsoft.com/office/drawing/2014/chartex" xmlns:cx1="http://schemas.microsoft.com/office/drawing/2015/9/8/chartex" xmlns:cx2="http://schemas.microsoft.com/office/drawing/2015/10/21/chartex" xmlns:cx3="http://schemas.microsoft.com/office/drawing/2016/5/9/chartex" xmlns:cx4="http://schemas.microsoft.com/office/drawing/2016/5/10/chartex" xmlns:cx5="http://schemas.microsoft.com/office/drawing/2016/5/11/chartex" xmlns:cx6="http://schemas.microsoft.com/office/drawing/2016/5/12/chartex" xmlns:cx7="http://schemas.microsoft.com/office/drawing/2016/5/13/chartex" xmlns:cx8="http://schemas.microsoft.com/office/drawing/2016/5/14/chartex" xmlns:mc="http://schemas.openxmlformats.org/markup-compatibility/2006" xmlns:aink="http://schemas.microsoft.com/office/drawing/2016/ink" xmlns:am3d="http://schemas.microsoft.com/office/drawing/2017/model3d" xmlns:o="urn:schemas-microsoft-com:office:office" xmlns:oel="http://schemas.microsoft.com/office/2019/extlst" xmlns:r="http://schemas.openxmlformats.org/officeDocument/2006/relationships" xmlns:m="http://schemas.openxmlformats.org/officeDocument/2006/math" xmlns:v="urn:schemas-microsoft-com:vml" xmlns:wp14="http://schemas.microsoft.com/office/word/2010/wordprocessingDrawing" xmlns:wp="http://schemas.openxmlformats.org/drawingml/2006/wordprocessingDrawing" xmlns:w10="urn:schemas-microsoft-com:office:word" xmlns:w="http://schemas.openxmlformats.org/wordprocessingml/2006/main" xmlns:w14="http://schemas.microsoft.com/office/word/2010/wordml" xmlns:w15="http://schemas.microsoft.com/office/word/2012/wordml" xmlns:w16cex="http://schemas.microsoft.com/office/word/2018/wordml/cex" xmlns:w16cid="http://schemas.microsoft.com/office/word/2016/wordml/cid" xmlns:w16="http://schemas.microsoft.com/office/word/2018/wordml" xmlns:w16du="http://schemas.microsoft.com/office/word/2023/wordml/word16du" xmlns:w16sdtdh="http://schemas.microsoft.com/office/word/2020/wordml/sdtdatahash" xmlns:w16sdtfl="http://schemas.microsoft.com/office/word/2024/wordml/sdtformatlock" xmlns:w16se="http://schemas.microsoft.com/office/word/2015/wordml/symex" xmlns:wpg="http://schemas.microsoft.com/office/word/2010/wordprocessingGroup" xmlns:wpi="http://schemas.microsoft.com/office/word/2010/wordprocessingInk" xmlns:wne="http://schemas.microsoft.com/office/word/2006/wordml" xmlns:wps="http://schemas.microsoft.com/office/word/2010/wordprocessingShape" mc:Ignorable="w14 w15 w16se w16cid w16 w16cex w16sdtdh w16sdtfl w16du wp14">
+  <w:sdt>
+    <w:sdtPr>
+      <w:id w:val="188353063"/>
+      <w:docPartObj>
+        <w:docPartGallery w:val="Page Numbers (Bottom of Page)"/>
+        <w:docPartUnique/>
+      </w:docPartObj>
+    </w:sdtPr>
+    <w:sdtEndPr>
+      <w:rPr>
+        <w:noProof/>
+      </w:rPr>
+    </w:sdtEndPr>
+    <w:sdtContent>
+      <w:p>
+        <w:pPr>
+          <w:pStyle w:val="Footer"/>
+          <w:jc w:val="right"/>
+        </w:pPr>
+        <w:r>
+          <w:fldChar w:fldCharType="begin"/>
+        </w:r>
+        <w:r>
+          <w:instrText xml:space="preserve"> PAGE   \* MERGEFORMAT </w:instrText>
+        </w:r>
+        <w:r>
+          <w:fldChar w:fldCharType="separate"/>
+        </w:r>
+        <w:r>
+          <w:rPr>
+            <w:noProof/>
+          </w:rPr>
+          <w:t>2</w:t>
+        </w:r>
+        <w:r>
+          <w:rPr>
+            <w:noProof/>
+          </w:rPr>
+          <w:fldChar w:fldCharType="end"/>
+        </w:r>
+      </w:p>
+    </w:sdtContent>
+  </w:sdt>
   <w:p>
     <w:pPr>
       <w:pStyle w:val="Footer"/>
       <w:jc w:val="center"/>
     </w:pPr>
-    <w:r>
-      <w:rPr>
-        <w:color w:val="4B596B"/>
-        <w:sz w:val="18"/>
-      </w:rPr>
-      <w:t xml:space="preserve">SmartExpense – Nhóm 03   |   23/10/2026   |   Trang </w:t>
-    </w:r>
-    <w:r>
-      <w:fldChar w:fldCharType="begin"/>
-    </w:r>
-    <w:r>
-      <w:instrText>PAGE</w:instrText>
-    </w:r>
-    <w:r>
-      <w:fldChar w:fldCharType="separate"/>
-    </w:r>
-    <w:r>
-      <w:rPr>
-        <w:noProof/>
-      </w:rPr>
-      <w:t>1</w:t>
-    </w:r>
-    <w:r>
-      <w:fldChar w:fldCharType="end"/>
-    </w:r>
   </w:p>
 </w:ftr>
 </file>
@@ -3314,14 +3252,6 @@
       <w:pStyle w:val="Header"/>
       <w:jc w:val="right"/>
     </w:pPr>
-    <w:r>
-      <w:rPr>
-        <w:b/>
-        <w:color w:val="4B596B"/>
-        <w:sz w:val="18"/>
-      </w:rPr>
-      <w:t>SMARTEXPENSE   •   PROJECT PROPOSAL</w:t>
-    </w:r>
   </w:p>
 </w:hdr>
 </file>
@@ -4139,6 +4069,7 @@
   <w:style w:type="character" w:default="1" w:styleId="DefaultParagraphFont">
     <w:name w:val="Default Paragraph Font"/>
     <w:uiPriority w:val="1"/>
+    <w:semiHidden/>
     <w:unhideWhenUsed/>
   </w:style>
   <w:style w:type="table" w:default="1" w:styleId="TableNormal">

</xml_diff>